<commit_message>
Fix variations alignment on same cell templates and repeat uom for variations
</commit_message>
<xml_diff>
--- a/templates/ifs_purchase_order.docx
+++ b/templates/ifs_purchase_order.docx
@@ -979,19 +979,37 @@
           <w:p>
             <w:pPr>
               <w:rPr>
-                <w:rFonts w:ascii="Arial" w:hAnsi="Arial" w:cs="Arial"/>
-                <w:sz w:val="20"/>
-                <w:szCs w:val="20"/>
-              </w:rPr>
-            </w:pPr>
-            <w:r>
-              <w:rPr>
                 <w:rStyle w:val="fTableCell"/>
                 <w:rFonts w:ascii="Arial" w:hAnsi="Arial" w:cs="Arial"/>
                 <w:sz w:val="20"/>
                 <w:szCs w:val="20"/>
               </w:rPr>
+            </w:pPr>
+            <w:r>
+              <w:rPr>
+                <w:rStyle w:val="fTableCell"/>
+                <w:rFonts w:ascii="Arial" w:hAnsi="Arial" w:cs="Arial"/>
+                <w:sz w:val="20"/>
+                <w:szCs w:val="20"/>
+              </w:rPr>
               <w:t>${product_name}</w:t>
+            </w:r>
+          </w:p>
+          <w:p>
+            <w:pPr>
+              <w:rPr>
+                <w:rFonts w:ascii="Arial" w:hAnsi="Arial" w:cs="Arial"/>
+                <w:sz w:val="20"/>
+                <w:szCs w:val="20"/>
+              </w:rPr>
+            </w:pPr>
+            <w:r>
+              <w:rPr>
+                <w:rFonts w:ascii="Arial" w:hAnsi="Arial" w:cs="Arial"/>
+                <w:sz w:val="20"/>
+                <w:szCs w:val="20"/>
+              </w:rPr>
+              <w:t>${description}</w:t>
             </w:r>
           </w:p>
         </w:tc>

</xml_diff>